<commit_message>
docs: update authors to Le Quoc Khanh and Ho Anh Khoa across all system files and word reports
</commit_message>
<xml_diff>
--- a/Danh_sach_tai_khoan_nguoi_dung_SIMPS.docx
+++ b/Danh_sach_tai_khoan_nguoi_dung_SIMPS.docx
@@ -29,7 +29,7 @@
           <w:color w:val="475569"/>
           <w:sz w:val="20"/>
         </w:rPr>
-        <w:t>Học sinh thực hiện: Nguyễn Quốc Khánh | GVHD: Phan Thuý Quỳnh</w:t>
+        <w:t>Học sinh thực hiện: Lê Quốc Khánh và Hồ Anh Khoa | GVHD: Phan Thuý Quỳnh</w:t>
       </w:r>
     </w:p>
     <w:p>
@@ -3592,7 +3592,7 @@
           <w:color w:val="94A3B8"/>
           <w:sz w:val="17"/>
         </w:rPr>
-        <w:t>Xuất tự động ngày 24/10/2026 08:43:33 từ cơ sở dữ liệu: D:\KHKT\backend\simps.db</w:t>
+        <w:t>Xuất tự động ngày 24/10/2026 12:35:20 từ cơ sở dữ liệu: D:\KHKT\backend\simps.db</w:t>
       </w:r>
     </w:p>
     <w:sectPr>

</xml_diff>